<commit_message>
DOCS : Exercices Tableaux modifiés
</commit_message>
<xml_diff>
--- a/Tableaux/Exercice Tableau.docx
+++ b/Tableaux/Exercice Tableau.docx
@@ -113,6 +113,18 @@
         </w:numPr>
       </w:pPr>
       <w:r>
+        <w:t>Somme &lt;- 0</w:t>
+      </w:r>
+    </w:p>
+    <w:p>
+      <w:pPr>
+        <w:pStyle w:val="Paragraphedeliste"/>
+        <w:numPr>
+          <w:ilvl w:val="0"/>
+          <w:numId w:val="2"/>
+        </w:numPr>
+      </w:pPr>
+      <w:r>
         <w:t>POUR i de 0, taille de Note</w:t>
       </w:r>
       <w:r>
@@ -140,26 +152,30 @@
         </w:numPr>
       </w:pPr>
       <w:r>
-        <w:t xml:space="preserve">Somme &lt;- </w:t>
-      </w:r>
-      <w:proofErr w:type="gramStart"/>
-      <w:r>
-        <w:t>Note[</w:t>
-      </w:r>
-      <w:proofErr w:type="gramEnd"/>
-      <w:r>
-        <w:t>0, 1, 2]</w:t>
-      </w:r>
-    </w:p>
-    <w:p>
-      <w:pPr>
-        <w:pStyle w:val="Paragraphedeliste"/>
-        <w:numPr>
-          <w:ilvl w:val="1"/>
+        <w:t>Somme &lt;- Somme + index de i de Note</w:t>
+      </w:r>
+    </w:p>
+    <w:p>
+      <w:pPr>
+        <w:pStyle w:val="Paragraphedeliste"/>
+        <w:numPr>
+          <w:ilvl w:val="0"/>
           <w:numId w:val="2"/>
         </w:numPr>
       </w:pPr>
       <w:r>
+        <w:t>FIN POUR</w:t>
+      </w:r>
+    </w:p>
+    <w:p>
+      <w:pPr>
+        <w:pStyle w:val="Paragraphedeliste"/>
+        <w:numPr>
+          <w:ilvl w:val="0"/>
+          <w:numId w:val="2"/>
+        </w:numPr>
+      </w:pPr>
+      <w:r>
         <w:t>Moyenne &lt;- Somme / 3</w:t>
       </w:r>
     </w:p>
@@ -167,7 +183,7 @@
       <w:pPr>
         <w:pStyle w:val="Paragraphedeliste"/>
         <w:numPr>
-          <w:ilvl w:val="1"/>
+          <w:ilvl w:val="0"/>
           <w:numId w:val="2"/>
         </w:numPr>
       </w:pPr>
@@ -175,18 +191,6 @@
         <w:t>AFFICHER ‘Vous avez une moyenne de’ + Moyenne</w:t>
       </w:r>
     </w:p>
-    <w:p>
-      <w:pPr>
-        <w:pStyle w:val="Paragraphedeliste"/>
-        <w:numPr>
-          <w:ilvl w:val="0"/>
-          <w:numId w:val="2"/>
-        </w:numPr>
-      </w:pPr>
-      <w:r>
-        <w:t>FIN POUR</w:t>
-      </w:r>
-    </w:p>
     <w:p/>
     <w:p>
       <w:r>
@@ -218,6 +222,40 @@
       </w:r>
       <w:r>
         <w:t>[51, 100 ,50]</w:t>
+      </w:r>
+    </w:p>
+    <w:p>
+      <w:pPr>
+        <w:pStyle w:val="Paragraphedeliste"/>
+        <w:numPr>
+          <w:ilvl w:val="0"/>
+          <w:numId w:val="3"/>
+        </w:numPr>
+      </w:pPr>
+      <w:proofErr w:type="spellStart"/>
+      <w:r>
+        <w:t>ValeurMin</w:t>
+      </w:r>
+      <w:proofErr w:type="spellEnd"/>
+      <w:r>
+        <w:t xml:space="preserve"> &lt;- 0</w:t>
+      </w:r>
+    </w:p>
+    <w:p>
+      <w:pPr>
+        <w:pStyle w:val="Paragraphedeliste"/>
+        <w:numPr>
+          <w:ilvl w:val="0"/>
+          <w:numId w:val="3"/>
+        </w:numPr>
+      </w:pPr>
+      <w:proofErr w:type="spellStart"/>
+      <w:r>
+        <w:t>ValeurMax</w:t>
+      </w:r>
+      <w:proofErr w:type="spellEnd"/>
+      <w:r>
+        <w:t xml:space="preserve"> &lt;- 0</w:t>
       </w:r>
     </w:p>
     <w:p>
@@ -261,15 +299,7 @@
       </w:r>
       <w:proofErr w:type="spellEnd"/>
       <w:r>
-        <w:t xml:space="preserve"> &lt;- </w:t>
-      </w:r>
-      <w:proofErr w:type="gramStart"/>
-      <w:r>
-        <w:t>Nombres[</w:t>
-      </w:r>
-      <w:proofErr w:type="gramEnd"/>
-      <w:r>
-        <w:t>1]</w:t>
+        <w:t xml:space="preserve"> &lt;- index 0 de Nombres</w:t>
       </w:r>
     </w:p>
     <w:p>
@@ -280,22 +310,34 @@
           <w:numId w:val="3"/>
         </w:numPr>
       </w:pPr>
+      <w:r>
+        <w:t xml:space="preserve">SI </w:t>
+      </w:r>
       <w:proofErr w:type="spellStart"/>
       <w:r>
-        <w:t>ValeurMin</w:t>
+        <w:t>ValeurMax</w:t>
       </w:r>
       <w:proofErr w:type="spellEnd"/>
       <w:r>
-        <w:t xml:space="preserve"> &lt;- </w:t>
-      </w:r>
-      <w:proofErr w:type="gramStart"/>
-      <w:r>
-        <w:t>Nombres[</w:t>
-      </w:r>
-      <w:proofErr w:type="gramEnd"/>
-      <w:r>
-        <w:t>0]</w:t>
-      </w:r>
+        <w:t xml:space="preserve"> &gt; index 1 et 2 de Nombres</w:t>
+      </w:r>
+    </w:p>
+    <w:p>
+      <w:pPr>
+        <w:pStyle w:val="Paragraphedeliste"/>
+        <w:numPr>
+          <w:ilvl w:val="2"/>
+          <w:numId w:val="3"/>
+        </w:numPr>
+      </w:pPr>
+      <w:r>
+        <w:t xml:space="preserve">AFFICHER </w:t>
+      </w:r>
+      <w:proofErr w:type="spellStart"/>
+      <w:r>
+        <w:t>ValeurMax</w:t>
+      </w:r>
+      <w:proofErr w:type="spellEnd"/>
     </w:p>
     <w:p>
       <w:pPr>
@@ -306,37 +348,98 @@
         </w:numPr>
       </w:pPr>
       <w:r>
+        <w:t>FIN SI</w:t>
+      </w:r>
+    </w:p>
+    <w:p>
+      <w:pPr>
+        <w:pStyle w:val="Paragraphedeliste"/>
+        <w:numPr>
+          <w:ilvl w:val="1"/>
+          <w:numId w:val="3"/>
+        </w:numPr>
+      </w:pPr>
+      <w:proofErr w:type="spellStart"/>
+      <w:r>
+        <w:t>ValeurMin</w:t>
+      </w:r>
+      <w:proofErr w:type="spellEnd"/>
+      <w:r>
+        <w:t xml:space="preserve"> &lt;- index 1 de Nombres</w:t>
+      </w:r>
+    </w:p>
+    <w:p>
+      <w:pPr>
+        <w:pStyle w:val="Paragraphedeliste"/>
+        <w:numPr>
+          <w:ilvl w:val="1"/>
+          <w:numId w:val="3"/>
+        </w:numPr>
+      </w:pPr>
+      <w:r>
+        <w:t xml:space="preserve">SI </w:t>
+      </w:r>
+      <w:proofErr w:type="spellStart"/>
+      <w:r>
+        <w:t>ValeurMin</w:t>
+      </w:r>
+      <w:proofErr w:type="spellEnd"/>
+      <w:r>
+        <w:t xml:space="preserve"> &lt; index 0 et 2</w:t>
+      </w:r>
+    </w:p>
+    <w:p>
+      <w:pPr>
+        <w:pStyle w:val="Paragraphedeliste"/>
+        <w:numPr>
+          <w:ilvl w:val="2"/>
+          <w:numId w:val="3"/>
+        </w:numPr>
+      </w:pPr>
+      <w:r>
         <w:t xml:space="preserve">AFFICHER </w:t>
       </w:r>
       <w:proofErr w:type="spellStart"/>
       <w:r>
-        <w:t>ValeurMax</w:t>
+        <w:t>ValeurMin</w:t>
       </w:r>
       <w:proofErr w:type="spellEnd"/>
-      <w:r>
-        <w:t xml:space="preserve"> et </w:t>
-      </w:r>
-      <w:proofErr w:type="spellStart"/>
-      <w:r>
-        <w:t>ValeurMin</w:t>
-      </w:r>
-      <w:proofErr w:type="spellEnd"/>
-    </w:p>
-    <w:p>
-      <w:pPr>
-        <w:pStyle w:val="Paragraphedeliste"/>
-        <w:numPr>
-          <w:ilvl w:val="0"/>
+    </w:p>
+    <w:p>
+      <w:pPr>
+        <w:pStyle w:val="Paragraphedeliste"/>
+        <w:numPr>
+          <w:ilvl w:val="1"/>
           <w:numId w:val="3"/>
         </w:numPr>
       </w:pPr>
       <w:r>
+        <w:t>FIN SI</w:t>
+      </w:r>
+    </w:p>
+    <w:p>
+      <w:pPr>
+        <w:pStyle w:val="Paragraphedeliste"/>
+        <w:numPr>
+          <w:ilvl w:val="0"/>
+          <w:numId w:val="3"/>
+        </w:numPr>
+      </w:pPr>
+      <w:r>
         <w:t>FIN POUR</w:t>
       </w:r>
     </w:p>
     <w:p/>
     <w:p>
       <w:r>
+        <w:br w:type="page"/>
+      </w:r>
+    </w:p>
+    <w:p>
+      <w:bookmarkStart w:id="0" w:name="_GoBack"/>
+      <w:bookmarkEnd w:id="0"/>
+      <w:r>
+        <w:lastRenderedPageBreak/>
         <w:t xml:space="preserve">EXERCICE 4 : </w:t>
       </w:r>
     </w:p>
@@ -410,8 +513,6 @@
       <w:r>
         <w:t xml:space="preserve"> &lt;- Nombre d’éléments</w:t>
       </w:r>
-      <w:bookmarkStart w:id="0" w:name="_GoBack"/>
-      <w:bookmarkEnd w:id="0"/>
     </w:p>
     <w:p>
       <w:pPr>
@@ -563,7 +664,7 @@
         <w:ind w:left="1440" w:hanging="360"/>
       </w:pPr>
     </w:lvl>
-    <w:lvl w:ilvl="2" w:tplc="040C001B" w:tentative="1">
+    <w:lvl w:ilvl="2" w:tplc="040C001B">
       <w:start w:val="1"/>
       <w:numFmt w:val="lowerRoman"/>
       <w:lvlText w:val="%3."/>
@@ -1217,6 +1318,7 @@
   <w:style w:type="character" w:default="1" w:styleId="Policepardfaut">
     <w:name w:val="Default Paragraph Font"/>
     <w:uiPriority w:val="1"/>
+    <w:semiHidden/>
     <w:unhideWhenUsed/>
   </w:style>
   <w:style w:type="table" w:default="1" w:styleId="TableauNormal">

</xml_diff>

<commit_message>
DOCS : Modifs exercice tableau
</commit_message>
<xml_diff>
--- a/Tableaux/Exercice Tableau.docx
+++ b/Tableaux/Exercice Tableau.docx
@@ -282,7 +282,13 @@
         </w:numPr>
       </w:pPr>
       <w:r>
-        <w:t>AFFICHER index i de Nombres</w:t>
+        <w:t>AFFICHER index</w:t>
+      </w:r>
+      <w:r>
+        <w:t xml:space="preserve"> de</w:t>
+      </w:r>
+      <w:r>
+        <w:t xml:space="preserve"> i de Nombres</w:t>
       </w:r>
     </w:p>
     <w:p>
@@ -341,6 +347,24 @@
     </w:p>
     <w:p>
       <w:pPr>
+        <w:ind w:left="1416"/>
+      </w:pPr>
+      <w:r>
+        <w:t xml:space="preserve">SINON </w:t>
+      </w:r>
+      <w:proofErr w:type="spellStart"/>
+      <w:r>
+        <w:t>ValeurMax</w:t>
+      </w:r>
+      <w:proofErr w:type="spellEnd"/>
+      <w:r>
+        <w:t xml:space="preserve"> &lt;- index la plus grande</w:t>
+      </w:r>
+      <w:bookmarkStart w:id="0" w:name="_GoBack"/>
+      <w:bookmarkEnd w:id="0"/>
+    </w:p>
+    <w:p>
+      <w:pPr>
         <w:pStyle w:val="Paragraphedeliste"/>
         <w:numPr>
           <w:ilvl w:val="1"/>
@@ -436,8 +460,6 @@
       </w:r>
     </w:p>
     <w:p>
-      <w:bookmarkStart w:id="0" w:name="_GoBack"/>
-      <w:bookmarkEnd w:id="0"/>
       <w:r>
         <w:lastRenderedPageBreak/>
         <w:t xml:space="preserve">EXERCICE 4 : </w:t>

</xml_diff>